<commit_message>
Update LifeMetric docs for UK v1 scope; restrict agent GitHub push/merge permissions
</commit_message>
<xml_diff>
--- a/LifeMetric/docs/LifeMetrics_Access_Control.docx
+++ b/LifeMetric/docs/LifeMetrics_Access_Control.docx
@@ -3,9 +3,6 @@
 <w:document xmlns:wpc="http://schemas.microsoft.com/office/word/2010/wordprocessingCanvas" xmlns:mo="http://schemas.microsoft.com/office/mac/office/2008/main" xmlns:mc="http://schemas.openxmlformats.org/markup-compatibility/2006" xmlns:mv="urn:schemas-microsoft-com:mac:vml" xmlns:o="urn:schemas-microsoft-com:office:office" xmlns:r="http://schemas.openxmlformats.org/officeDocument/2006/relationships" xmlns:m="http://schemas.openxmlformats.org/officeDocument/2006/math" xmlns:v="urn:schemas-microsoft-com:vml" xmlns:wp14="http://schemas.microsoft.com/office/word/2010/wordprocessingDrawing" xmlns:wp="http://schemas.openxmlformats.org/drawingml/2006/wordprocessingDrawing" xmlns:w10="urn:schemas-microsoft-com:office:word" xmlns:w="http://schemas.openxmlformats.org/wordprocessingml/2006/main" xmlns:w14="http://schemas.microsoft.com/office/word/2010/wordml" xmlns:wpg="http://schemas.microsoft.com/office/word/2010/wordprocessingGroup" xmlns:wpi="http://schemas.microsoft.com/office/word/2010/wordprocessingInk" xmlns:wne="http://schemas.microsoft.com/office/word/2006/wordml" xmlns:wps="http://schemas.microsoft.com/office/word/2010/wordprocessingShape" mc:Ignorable="w14 wp14">
   <w:body>
     <w:p>
-      <w:pPr>
-        <w:pStyle w:val="Heading1"/>
-      </w:pPr>
       <w:r>
         <w:t>Role-Based Access Control &amp; Admin Console Specification</w:t>
       </w:r>
@@ -21,19 +18,13 @@
       </w:r>
     </w:p>
     <w:p>
-      <w:pPr>
-        <w:pStyle w:val="ListBullet"/>
-      </w:pPr>
       <w:r>
-        <w:t xml:space="preserve">  Sade Adewale, Product Strategist</w:t>
+        <w:t>Sade Adewale, Product Strategist</w:t>
       </w:r>
     </w:p>
     <w:p>
-      <w:pPr>
-        <w:pStyle w:val="ListBullet"/>
-      </w:pPr>
       <w:r>
-        <w:t xml:space="preserve">  Arjun Mehta, Solution Architect</w:t>
+        <w:t>Arjun Mehta, Solution Architect</w:t>
       </w:r>
     </w:p>
     <w:p>
@@ -58,7 +49,7 @@
     </w:p>
     <w:p>
       <w:pPr>
-        <w:pStyle w:val="Heading2"/>
+        <w:pStyle w:val="ListNumber"/>
       </w:pPr>
       <w:r>
         <w:t>1. Executive Summary</w:t>
@@ -81,7 +72,7 @@
     </w:p>
     <w:p>
       <w:pPr>
-        <w:pStyle w:val="Heading2"/>
+        <w:pStyle w:val="ListNumber"/>
       </w:pPr>
       <w:r>
         <w:t>2. System Personas &amp; User Types</w:t>
@@ -106,19 +97,13 @@
       </w:r>
     </w:p>
     <w:p>
-      <w:pPr>
-        <w:pStyle w:val="ListBullet"/>
-      </w:pPr>
       <w:r>
-        <w:t xml:space="preserve">  Description: The elderly resident being monitored.</w:t>
+        <w:t>Description: The elderly resident being monitored.</w:t>
       </w:r>
     </w:p>
     <w:p>
-      <w:pPr>
-        <w:pStyle w:val="ListBullet"/>
-      </w:pPr>
       <w:r>
-        <w:t xml:space="preserve">  Access Scope: Completely passive. Has no direct app interaction, but owns rights to data portability, historical trend extraction, and explicit consent revocation (managed via family or clinical proxies).</w:t>
+        <w:t>Access Scope: Completely passive. Has no direct app interaction, but owns rights to data portability, historical trend extraction, and explicit consent revocation (managed via family or clinical proxies).</w:t>
       </w:r>
     </w:p>
     <w:p>
@@ -130,19 +115,13 @@
       </w:r>
     </w:p>
     <w:p>
-      <w:pPr>
-        <w:pStyle w:val="ListBullet"/>
-      </w:pPr>
       <w:r>
-        <w:t xml:space="preserve">  Description: Private family member or designated guardian.</w:t>
+        <w:t>Description: Private family member or designated guardian.</w:t>
       </w:r>
     </w:p>
     <w:p>
-      <w:pPr>
-        <w:pStyle w:val="ListBullet"/>
-      </w:pPr>
       <w:r>
-        <w:t xml:space="preserve">  Access Scope: Accesses a read-only mobile app. Can view real-time alert notifications and standard wellbeing summaries for their specific resident only.</w:t>
+        <w:t>Access Scope: Accesses a read-only mobile app. Can view real-time alert notifications and standard wellbeing summaries for their specific resident only.</w:t>
       </w:r>
     </w:p>
     <w:p>
@@ -154,19 +133,13 @@
       </w:r>
     </w:p>
     <w:p>
-      <w:pPr>
-        <w:pStyle w:val="ListBullet"/>
-      </w:pPr>
       <w:r>
-        <w:t xml:space="preserve">  Description: On-duty nursing staff in a care home or virtual ward.</w:t>
+        <w:t>Description: On-duty nursing staff in a care home or virtual ward.</w:t>
       </w:r>
     </w:p>
     <w:p>
-      <w:pPr>
-        <w:pStyle w:val="ListBullet"/>
-      </w:pPr>
       <w:r>
-        <w:t xml:space="preserve">  Access Scope: Accesses the active clinical web/tablet dashboard. Receives real-time local fall/bed-exit alerts, views heart/respiratory rates, and inputs daily clinical notes.</w:t>
+        <w:t>Access Scope: Accesses the active clinical web/tablet dashboard. Receives real-time local fall/bed-exit alerts, views heart/respiratory rates, and inputs daily clinical notes.</w:t>
       </w:r>
     </w:p>
     <w:p>
@@ -178,19 +151,13 @@
       </w:r>
     </w:p>
     <w:p>
-      <w:pPr>
-        <w:pStyle w:val="ListBullet"/>
-      </w:pPr>
       <w:r>
-        <w:t xml:space="preserve">  Description: Care home manager, billing manager, or local IT leader.</w:t>
+        <w:t>Description: Care home manager, billing manager, or local IT leader.</w:t>
       </w:r>
     </w:p>
     <w:p>
-      <w:pPr>
-        <w:pStyle w:val="ListBullet"/>
-      </w:pPr>
       <w:r>
-        <w:t xml:space="preserve">  Access Scope: Accesses the B2B Tenant Admin Console. Manages staff rosters, device-to-room allocations, and facility-level billing/subscriptions. Zero visibility into patient clinical vitals or real-time point-cloud metadata to comply with HIPAA data minimization.</w:t>
+        <w:t>Access Scope: Accesses the B2B Tenant Admin Console. Manages staff rosters, device-to-room allocations, and facility-level billing/subscriptions. Zero visibility into patient clinical vitals or real-time point-cloud metadata to comply with HIPAA data minimization.</w:t>
       </w:r>
     </w:p>
     <w:p>
@@ -202,19 +169,13 @@
       </w:r>
     </w:p>
     <w:p>
-      <w:pPr>
-        <w:pStyle w:val="ListBullet"/>
-      </w:pPr>
       <w:r>
-        <w:t xml:space="preserve">  Description: LifeMetric internal operations and dev-ops staff.</w:t>
+        <w:t>Description: LifeMetric internal operations and dev-ops staff.</w:t>
       </w:r>
     </w:p>
     <w:p>
-      <w:pPr>
-        <w:pStyle w:val="ListBullet"/>
-      </w:pPr>
       <w:r>
-        <w:t xml:space="preserve">  Access Scope: Accesses the global SaaS Ops Console. Tracks fleet-wide hardware connectivity, monitors battery/power health, triggers OTA firmware updates, and manages global tenant subscriptions. Strictly locked out of all patient-identifiable data (PII) and vital sign logs.</w:t>
+        <w:t>Access Scope: Accesses the global SaaS Ops Console. Tracks fleet-wide hardware connectivity, monitors battery/power health, triggers OTA firmware updates, and manages global tenant subscriptions. Strictly locked out of all patient-identifiable data (PII) and vital sign logs.</w:t>
       </w:r>
     </w:p>
     <w:p>
@@ -224,7 +185,7 @@
     </w:p>
     <w:p>
       <w:pPr>
-        <w:pStyle w:val="Heading2"/>
+        <w:pStyle w:val="ListNumber"/>
       </w:pPr>
       <w:r>
         <w:t>3. Core Privilege Matrix</w:t>
@@ -240,433 +201,206 @@
         <w:t>To implement these personas, we enforce the following system-wide permissions matrix. Any API endpoint requests must match a valid token-extracted claim matching the defined scopes:</w:t>
       </w:r>
     </w:p>
-    <w:tbl>
-      <w:tblPr>
-        <w:tblStyle w:val="LightShading-Accent1"/>
-        <w:tblW w:type="auto" w:w="0"/>
-        <w:tblLook w:firstColumn="1" w:firstRow="1" w:lastColumn="0" w:lastRow="0" w:noHBand="0" w:noVBand="1" w:val="04A0"/>
-      </w:tblPr>
-      <w:tblGrid>
-        <w:gridCol w:w="1080"/>
-        <w:gridCol w:w="1080"/>
-        <w:gridCol w:w="1080"/>
-        <w:gridCol w:w="1080"/>
-        <w:gridCol w:w="1080"/>
-        <w:gridCol w:w="1080"/>
-        <w:gridCol w:w="1080"/>
-        <w:gridCol w:w="1080"/>
-      </w:tblGrid>
-      <w:tr>
-        <w:tc>
-          <w:tcPr>
-            <w:tcW w:type="dxa" w:w="1080"/>
-          </w:tcPr>
-          <w:p>
-            <w:r>
-              <w:t>Role Name</w:t>
-            </w:r>
-          </w:p>
-        </w:tc>
-        <w:tc>
-          <w:tcPr>
-            <w:tcW w:type="dxa" w:w="1080"/>
-          </w:tcPr>
-          <w:p>
-            <w:r>
-              <w:t>Scope Key</w:t>
-            </w:r>
-          </w:p>
-        </w:tc>
-        <w:tc>
-          <w:tcPr>
-            <w:tcW w:type="dxa" w:w="1080"/>
-          </w:tcPr>
-          <w:p>
-            <w:r>
-              <w:t>Patient PII</w:t>
-            </w:r>
-          </w:p>
-        </w:tc>
-        <w:tc>
-          <w:tcPr>
-            <w:tcW w:type="dxa" w:w="1080"/>
-          </w:tcPr>
-          <w:p>
-            <w:r>
-              <w:t>Patient Vitals</w:t>
-            </w:r>
-          </w:p>
-        </w:tc>
-        <w:tc>
-          <w:tcPr>
-            <w:tcW w:type="dxa" w:w="1080"/>
-          </w:tcPr>
-          <w:p>
-            <w:r>
-              <w:t>Alert Streams</w:t>
-            </w:r>
-          </w:p>
-        </w:tc>
-        <w:tc>
-          <w:tcPr>
-            <w:tcW w:type="dxa" w:w="1080"/>
-          </w:tcPr>
-          <w:p>
-            <w:r>
-              <w:t>Device Config</w:t>
-            </w:r>
-          </w:p>
-        </w:tc>
-        <w:tc>
-          <w:tcPr>
-            <w:tcW w:type="dxa" w:w="1080"/>
-          </w:tcPr>
-          <w:p>
-            <w:r>
-              <w:t>Billing / Plan</w:t>
-            </w:r>
-          </w:p>
-        </w:tc>
-        <w:tc>
-          <w:tcPr>
-            <w:tcW w:type="dxa" w:w="1080"/>
-          </w:tcPr>
-          <w:p>
-            <w:r>
-              <w:t>Audit Logs</w:t>
-            </w:r>
-          </w:p>
-        </w:tc>
-      </w:tr>
-      <w:tr>
-        <w:tc>
-          <w:tcPr>
-            <w:tcW w:type="dxa" w:w="1080"/>
-          </w:tcPr>
-          <w:p>
-            <w:r>
-              <w:t>SaaS Super Admin</w:t>
-            </w:r>
-          </w:p>
-        </w:tc>
-        <w:tc>
-          <w:tcPr>
-            <w:tcW w:type="dxa" w:w="1080"/>
-          </w:tcPr>
-          <w:p>
-            <w:r>
-              <w:t>super:admin</w:t>
-            </w:r>
-          </w:p>
-        </w:tc>
-        <w:tc>
-          <w:tcPr>
-            <w:tcW w:type="dxa" w:w="1080"/>
-          </w:tcPr>
-          <w:p>
-            <w:r>
-              <w:t>No Access</w:t>
-            </w:r>
-          </w:p>
-        </w:tc>
-        <w:tc>
-          <w:tcPr>
-            <w:tcW w:type="dxa" w:w="1080"/>
-          </w:tcPr>
-          <w:p>
-            <w:r>
-              <w:t>No Access</w:t>
-            </w:r>
-          </w:p>
-        </w:tc>
-        <w:tc>
-          <w:tcPr>
-            <w:tcW w:type="dxa" w:w="1080"/>
-          </w:tcPr>
-          <w:p>
-            <w:r>
-              <w:t>No Access</w:t>
-            </w:r>
-          </w:p>
-        </w:tc>
-        <w:tc>
-          <w:tcPr>
-            <w:tcW w:type="dxa" w:w="1080"/>
-          </w:tcPr>
-          <w:p>
-            <w:r>
-              <w:t>Read / Write</w:t>
-            </w:r>
-          </w:p>
-        </w:tc>
-        <w:tc>
-          <w:tcPr>
-            <w:tcW w:type="dxa" w:w="1080"/>
-          </w:tcPr>
-          <w:p>
-            <w:r>
-              <w:t>Read / Write</w:t>
-            </w:r>
-          </w:p>
-        </w:tc>
-        <w:tc>
-          <w:tcPr>
-            <w:tcW w:type="dxa" w:w="1080"/>
-          </w:tcPr>
-          <w:p>
-            <w:r>
-              <w:t>Read Only</w:t>
-            </w:r>
-          </w:p>
-        </w:tc>
-      </w:tr>
-      <w:tr>
-        <w:tc>
-          <w:tcPr>
-            <w:tcW w:type="dxa" w:w="1080"/>
-          </w:tcPr>
-          <w:p>
-            <w:r>
-              <w:t>Facility Admin</w:t>
-            </w:r>
-          </w:p>
-        </w:tc>
-        <w:tc>
-          <w:tcPr>
-            <w:tcW w:type="dxa" w:w="1080"/>
-          </w:tcPr>
-          <w:p>
-            <w:r>
-              <w:t>facility:admin</w:t>
-            </w:r>
-          </w:p>
-        </w:tc>
-        <w:tc>
-          <w:tcPr>
-            <w:tcW w:type="dxa" w:w="1080"/>
-          </w:tcPr>
-          <w:p>
-            <w:r>
-              <w:t>Read / Write</w:t>
-            </w:r>
-          </w:p>
-        </w:tc>
-        <w:tc>
-          <w:tcPr>
-            <w:tcW w:type="dxa" w:w="1080"/>
-          </w:tcPr>
-          <w:p>
-            <w:r>
-              <w:t>No Access</w:t>
-            </w:r>
-          </w:p>
-        </w:tc>
-        <w:tc>
-          <w:tcPr>
-            <w:tcW w:type="dxa" w:w="1080"/>
-          </w:tcPr>
-          <w:p>
-            <w:r>
-              <w:t>No Access</w:t>
-            </w:r>
-          </w:p>
-        </w:tc>
-        <w:tc>
-          <w:tcPr>
-            <w:tcW w:type="dxa" w:w="1080"/>
-          </w:tcPr>
-          <w:p>
-            <w:r>
-              <w:t>Read / Write</w:t>
-            </w:r>
-          </w:p>
-        </w:tc>
-        <w:tc>
-          <w:tcPr>
-            <w:tcW w:type="dxa" w:w="1080"/>
-          </w:tcPr>
-          <w:p>
-            <w:r>
-              <w:t>Read / Write</w:t>
-            </w:r>
-          </w:p>
-        </w:tc>
-        <w:tc>
-          <w:tcPr>
-            <w:tcW w:type="dxa" w:w="1080"/>
-          </w:tcPr>
-          <w:p>
-            <w:r>
-              <w:t>Read Only</w:t>
-            </w:r>
-          </w:p>
-        </w:tc>
-      </w:tr>
-      <w:tr>
-        <w:tc>
-          <w:tcPr>
-            <w:tcW w:type="dxa" w:w="1080"/>
-          </w:tcPr>
-          <w:p>
-            <w:r>
-              <w:t>Clinical Caregiver</w:t>
-            </w:r>
-          </w:p>
-        </w:tc>
-        <w:tc>
-          <w:tcPr>
-            <w:tcW w:type="dxa" w:w="1080"/>
-          </w:tcPr>
-          <w:p>
-            <w:r>
-              <w:t>clinical:staff</w:t>
-            </w:r>
-          </w:p>
-        </w:tc>
-        <w:tc>
-          <w:tcPr>
-            <w:tcW w:type="dxa" w:w="1080"/>
-          </w:tcPr>
-          <w:p>
-            <w:r>
-              <w:t>Read Only</w:t>
-            </w:r>
-          </w:p>
-        </w:tc>
-        <w:tc>
-          <w:tcPr>
-            <w:tcW w:type="dxa" w:w="1080"/>
-          </w:tcPr>
-          <w:p>
-            <w:r>
-              <w:t>Read Only</w:t>
-            </w:r>
-          </w:p>
-        </w:tc>
-        <w:tc>
-          <w:tcPr>
-            <w:tcW w:type="dxa" w:w="1080"/>
-          </w:tcPr>
-          <w:p>
-            <w:r>
-              <w:t>Read / Write</w:t>
-            </w:r>
-          </w:p>
-        </w:tc>
-        <w:tc>
-          <w:tcPr>
-            <w:tcW w:type="dxa" w:w="1080"/>
-          </w:tcPr>
-          <w:p>
-            <w:r>
-              <w:t>Read Only</w:t>
-            </w:r>
-          </w:p>
-        </w:tc>
-        <w:tc>
-          <w:tcPr>
-            <w:tcW w:type="dxa" w:w="1080"/>
-          </w:tcPr>
-          <w:p>
-            <w:r>
-              <w:t>No Access</w:t>
-            </w:r>
-          </w:p>
-        </w:tc>
-        <w:tc>
-          <w:tcPr>
-            <w:tcW w:type="dxa" w:w="1080"/>
-          </w:tcPr>
-          <w:p>
-            <w:r>
-              <w:t>No Access</w:t>
-            </w:r>
-          </w:p>
-        </w:tc>
-      </w:tr>
-      <w:tr>
-        <w:tc>
-          <w:tcPr>
-            <w:tcW w:type="dxa" w:w="1080"/>
-          </w:tcPr>
-          <w:p>
-            <w:r>
-              <w:t>Family Caregiver</w:t>
-            </w:r>
-          </w:p>
-        </w:tc>
-        <w:tc>
-          <w:tcPr>
-            <w:tcW w:type="dxa" w:w="1080"/>
-          </w:tcPr>
-          <w:p>
-            <w:r>
-              <w:t>family:guardian</w:t>
-            </w:r>
-          </w:p>
-        </w:tc>
-        <w:tc>
-          <w:tcPr>
-            <w:tcW w:type="dxa" w:w="1080"/>
-          </w:tcPr>
-          <w:p>
-            <w:r>
-              <w:t>Read Only (Self)</w:t>
-            </w:r>
-          </w:p>
-        </w:tc>
-        <w:tc>
-          <w:tcPr>
-            <w:tcW w:type="dxa" w:w="1080"/>
-          </w:tcPr>
-          <w:p>
-            <w:r>
-              <w:t>Read Only (Self)</w:t>
-            </w:r>
-          </w:p>
-        </w:tc>
-        <w:tc>
-          <w:tcPr>
-            <w:tcW w:type="dxa" w:w="1080"/>
-          </w:tcPr>
-          <w:p>
-            <w:r>
-              <w:t>Read Only (Self)</w:t>
-            </w:r>
-          </w:p>
-        </w:tc>
-        <w:tc>
-          <w:tcPr>
-            <w:tcW w:type="dxa" w:w="1080"/>
-          </w:tcPr>
-          <w:p>
-            <w:r>
-              <w:t>No Access</w:t>
-            </w:r>
-          </w:p>
-        </w:tc>
-        <w:tc>
-          <w:tcPr>
-            <w:tcW w:type="dxa" w:w="1080"/>
-          </w:tcPr>
-          <w:p>
-            <w:r>
-              <w:t>No Access</w:t>
-            </w:r>
-          </w:p>
-        </w:tc>
-        <w:tc>
-          <w:tcPr>
-            <w:tcW w:type="dxa" w:w="1080"/>
-          </w:tcPr>
-          <w:p>
-            <w:r>
-              <w:t>No Access</w:t>
-            </w:r>
-          </w:p>
-        </w:tc>
-      </w:tr>
-    </w:tbl>
+    <w:p>
+      <w:r>
+        <w:t>Role Name</w:t>
+      </w:r>
+    </w:p>
+    <w:p>
+      <w:r>
+        <w:t>Scope Key</w:t>
+      </w:r>
+    </w:p>
+    <w:p>
+      <w:r>
+        <w:t>Patient PII</w:t>
+      </w:r>
+    </w:p>
+    <w:p>
+      <w:r>
+        <w:t>Patient Vitals</w:t>
+      </w:r>
+    </w:p>
+    <w:p>
+      <w:r>
+        <w:t>Alert Streams</w:t>
+      </w:r>
+    </w:p>
+    <w:p>
+      <w:r>
+        <w:t>Device Config</w:t>
+      </w:r>
+    </w:p>
+    <w:p>
+      <w:r>
+        <w:t>Billing / Plan</w:t>
+      </w:r>
+    </w:p>
+    <w:p>
+      <w:r>
+        <w:t>Audit Logs</w:t>
+      </w:r>
+    </w:p>
+    <w:p>
+      <w:r>
+        <w:t>SaaS Super Admin</w:t>
+      </w:r>
+    </w:p>
+    <w:p>
+      <w:r>
+        <w:t>super:admin</w:t>
+      </w:r>
+    </w:p>
+    <w:p>
+      <w:r>
+        <w:t>No Access</w:t>
+      </w:r>
+    </w:p>
+    <w:p>
+      <w:r>
+        <w:t>No Access</w:t>
+      </w:r>
+    </w:p>
+    <w:p>
+      <w:r>
+        <w:t>No Access</w:t>
+      </w:r>
+    </w:p>
+    <w:p>
+      <w:r>
+        <w:t>Read / Write</w:t>
+      </w:r>
+    </w:p>
+    <w:p>
+      <w:r>
+        <w:t>Read / Write</w:t>
+      </w:r>
+    </w:p>
+    <w:p>
+      <w:r>
+        <w:t>Read Only</w:t>
+      </w:r>
+    </w:p>
+    <w:p>
+      <w:r>
+        <w:t>Facility Admin</w:t>
+      </w:r>
+    </w:p>
+    <w:p>
+      <w:r>
+        <w:t>facility:admin</w:t>
+      </w:r>
+    </w:p>
+    <w:p>
+      <w:r>
+        <w:t>Read / Write</w:t>
+      </w:r>
+    </w:p>
+    <w:p>
+      <w:r>
+        <w:t>No Access</w:t>
+      </w:r>
+    </w:p>
+    <w:p>
+      <w:r>
+        <w:t>No Access</w:t>
+      </w:r>
+    </w:p>
+    <w:p>
+      <w:r>
+        <w:t>Read / Write</w:t>
+      </w:r>
+    </w:p>
+    <w:p>
+      <w:r>
+        <w:t>Read / Write</w:t>
+      </w:r>
+    </w:p>
+    <w:p>
+      <w:r>
+        <w:t>Read Only</w:t>
+      </w:r>
+    </w:p>
+    <w:p>
+      <w:r>
+        <w:t>Clinical Caregiver</w:t>
+      </w:r>
+    </w:p>
+    <w:p>
+      <w:r>
+        <w:t>clinical:staff</w:t>
+      </w:r>
+    </w:p>
+    <w:p>
+      <w:r>
+        <w:t>Read Only</w:t>
+      </w:r>
+    </w:p>
+    <w:p>
+      <w:r>
+        <w:t>Read Only</w:t>
+      </w:r>
+    </w:p>
+    <w:p>
+      <w:r>
+        <w:t>Read / Write</w:t>
+      </w:r>
+    </w:p>
+    <w:p>
+      <w:r>
+        <w:t>Read Only</w:t>
+      </w:r>
+    </w:p>
+    <w:p>
+      <w:r>
+        <w:t>No Access</w:t>
+      </w:r>
+    </w:p>
+    <w:p>
+      <w:r>
+        <w:t>No Access</w:t>
+      </w:r>
+    </w:p>
+    <w:p>
+      <w:r>
+        <w:t>Family Caregiver</w:t>
+      </w:r>
+    </w:p>
+    <w:p>
+      <w:r>
+        <w:t>family:guardian</w:t>
+      </w:r>
+    </w:p>
+    <w:p>
+      <w:r>
+        <w:t>Read Only (Self)</w:t>
+      </w:r>
+    </w:p>
+    <w:p>
+      <w:r>
+        <w:t>Read Only (Self)</w:t>
+      </w:r>
+    </w:p>
+    <w:p>
+      <w:r>
+        <w:t>Read Only (Self)</w:t>
+      </w:r>
+    </w:p>
+    <w:p>
+      <w:r>
+        <w:t>No Access</w:t>
+      </w:r>
+    </w:p>
+    <w:p>
+      <w:r>
+        <w:t>No Access</w:t>
+      </w:r>
+    </w:p>
+    <w:p>
+      <w:r>
+        <w:t>No Access</w:t>
+      </w:r>
+    </w:p>
     <w:p>
       <w:r>
         <w:t>---</w:t>
@@ -674,7 +408,7 @@
     </w:p>
     <w:p>
       <w:pPr>
-        <w:pStyle w:val="Heading2"/>
+        <w:pStyle w:val="ListNumber"/>
       </w:pPr>
       <w:r>
         <w:t>4. Technical Architecture: Authentication &amp; Session Management</w:t>
@@ -776,41 +510,26 @@
       </w:r>
     </w:p>
     <w:p>
-      <w:pPr>
-        <w:pStyle w:val="Heading3"/>
-      </w:pPr>
       <w:r>
         <w:t>4.1 Token-Based IAM (OAuth 2.0 &amp; OIDC)</w:t>
       </w:r>
     </w:p>
     <w:p>
-      <w:pPr>
-        <w:pStyle w:val="ListBullet"/>
-      </w:pPr>
       <w:r>
-        <w:t xml:space="preserve">  Identity Provider (IdP): Powered via an enterprise deployment of Keycloak (or AWS Cognito), managing global federation, user directory mapping, and MFA verification.</w:t>
+        <w:t>Identity Provider (IdP): Powered via an enterprise deployment of Keycloak (or AWS Cognito), managing global federation, user directory mapping, and MFA verification.</w:t>
       </w:r>
     </w:p>
     <w:p>
-      <w:pPr>
-        <w:pStyle w:val="ListBullet"/>
-      </w:pPr>
       <w:r>
-        <w:t xml:space="preserve">  Token Standard: JSON Web Tokens (JWT) signed via RS256 asymmetric keys.</w:t>
+        <w:t>Token Standard: JSON Web Tokens (JWT) signed via RS256 asymmetric keys.</w:t>
       </w:r>
     </w:p>
     <w:p>
-      <w:pPr>
-        <w:pStyle w:val="ListBullet"/>
-      </w:pPr>
       <w:r>
-        <w:t xml:space="preserve">  Session Lifespans: Short-lived access tokens (15 minutes) combined with sliding-window secure refresh tokens (8 hours).</w:t>
+        <w:t>Session Lifespans: Short-lived access tokens (15 minutes) combined with sliding-window secure refresh tokens (8 hours).</w:t>
       </w:r>
     </w:p>
     <w:p>
-      <w:pPr>
-        <w:pStyle w:val="Heading3"/>
-      </w:pPr>
       <w:r>
         <w:t>4.2 Row-Level Security (RLS) &amp; Tenant Isolation</w:t>
       </w:r>
@@ -821,19 +540,13 @@
       </w:r>
     </w:p>
     <w:p>
-      <w:pPr>
-        <w:pStyle w:val="ListBullet"/>
-      </w:pPr>
       <w:r>
-        <w:t xml:space="preserve">  All transactional and device tables are partitioned by tenant_id (Facility UUID).</w:t>
+        <w:t>All transactional and device tables are partitioned by tenant_id (Facility UUID).</w:t>
       </w:r>
     </w:p>
     <w:p>
-      <w:pPr>
-        <w:pStyle w:val="ListBullet"/>
-      </w:pPr>
       <w:r>
-        <w:t xml:space="preserve">  Postgres Row-Level Security is active:</w:t>
+        <w:t>Postgres Row-Level Security is active:</w:t>
       </w:r>
     </w:p>
     <w:p>
@@ -871,11 +584,8 @@
       </w:r>
     </w:p>
     <w:p>
-      <w:pPr>
-        <w:pStyle w:val="ListBullet"/>
-      </w:pPr>
       <w:r>
-        <w:t xml:space="preserve">  When a request is processed, our API gateway extracts the tenant_id claim from the JWT, sets the database session variables, and executes the query safely.</w:t>
+        <w:t>When a request is processed, our API gateway extracts the tenant_id claim from the JWT, sets the database session variables, and executes the query safely.</w:t>
       </w:r>
     </w:p>
     <w:p>
@@ -885,7 +595,7 @@
     </w:p>
     <w:p>
       <w:pPr>
-        <w:pStyle w:val="Heading2"/>
+        <w:pStyle w:val="ListNumber"/>
       </w:pPr>
       <w:r>
         <w:t>5. Administrative Management Consoles</w:t>
@@ -902,9 +612,6 @@
       </w:r>
     </w:p>
     <w:p>
-      <w:pPr>
-        <w:pStyle w:val="Heading3"/>
-      </w:pPr>
       <w:r>
         <w:t>5.1 B2B Facility Admin Console (For Local Managers)</w:t>
       </w:r>
@@ -915,49 +622,31 @@
       </w:r>
     </w:p>
     <w:p>
-      <w:pPr>
-        <w:pStyle w:val="ListBullet"/>
-      </w:pPr>
       <w:r>
-        <w:t xml:space="preserve">  Staff Roster Module: Add/remove nursing staff, update shifts, and allocate system permissions (e.g. assigning a new nurse to clinical:staff scope).</w:t>
+        <w:t>Staff Roster Module: Add/remove nursing staff, update shifts, and allocate system permissions (e.g. assigning a new nurse to clinical:staff scope).</w:t>
       </w:r>
     </w:p>
     <w:p>
-      <w:pPr>
-        <w:pStyle w:val="ListBullet"/>
-      </w:pPr>
       <w:r>
-        <w:t xml:space="preserve">  Room Allocation Dashboard: Visual map of the care facility. Allows administrators to pair physical device UUIDs to specific room numbers (e.g., Device LM-9284 paired to "Room 104 - Bathroom").</w:t>
+        <w:t>Room Allocation Dashboard: Visual map of the care facility. Allows administrators to pair physical device UUIDs to specific room numbers (e.g., Device LM-9284 paired to "Room 104 - Bathroom").</w:t>
       </w:r>
     </w:p>
     <w:p>
-      <w:pPr>
-        <w:pStyle w:val="ListBullet"/>
-      </w:pPr>
       <w:r>
-        <w:t xml:space="preserve">  Hardware Status Overview: Real-time visibility into local device statuses (Online, Offline, Power Fault, Calibrating).</w:t>
+        <w:t>Hardware Status Overview: Real-time visibility into local device statuses (Online, Offline, Power Fault, Calibrating).</w:t>
       </w:r>
     </w:p>
     <w:p>
-      <w:pPr>
-        <w:pStyle w:val="ListBullet"/>
-      </w:pPr>
       <w:r>
-        <w:t xml:space="preserve">  Billing &amp; Subscription Manager: View active monthly SaaS tiers, add payment methods (integrated with mybalanceapp.com), and download invoices.</w:t>
+        <w:t>Billing &amp; Subscription Manager: View active monthly SaaS tiers, add payment methods (integrated with mybalanceapp.com), and download invoices.</w:t>
       </w:r>
     </w:p>
     <w:p>
-      <w:pPr>
-        <w:pStyle w:val="ListBullet"/>
-      </w:pPr>
       <w:r>
-        <w:t xml:space="preserve">  Compliance Audit Viewer: Localized viewer showing access history (e.g., tracking which staff member accessed a resident's vital sign history, satisfying GDPR audit requirements).</w:t>
+        <w:t>Compliance Audit Viewer: Localized viewer showing access history (e.g., tracking which staff member accessed a resident's vital sign history, satisfying GDPR audit requirements).</w:t>
       </w:r>
     </w:p>
     <w:p>
-      <w:pPr>
-        <w:pStyle w:val="Heading3"/>
-      </w:pPr>
       <w:r>
         <w:t>5.2 Global SaaS Ops Console (For LifeMetric Engineering)</w:t>
       </w:r>
@@ -968,35 +657,23 @@
       </w:r>
     </w:p>
     <w:p>
-      <w:pPr>
-        <w:pStyle w:val="ListBullet"/>
-      </w:pPr>
       <w:r>
-        <w:t xml:space="preserve">  Tenant Management Panel: Provision new B2B accounts, suspend expired accounts, and configure custom enterprise pricing overrides.</w:t>
+        <w:t>Tenant Management Panel: Provision new B2B accounts, suspend expired accounts, and configure custom enterprise pricing overrides.</w:t>
       </w:r>
     </w:p>
     <w:p>
-      <w:pPr>
-        <w:pStyle w:val="ListBullet"/>
-      </w:pPr>
       <w:r>
-        <w:t xml:space="preserve">  Firmware &amp; Over-The-Air (OTA) Control Center: Standardized deployment panel to package, sign, and push firmware releases to physical devices incrementally (e.g., rolling out Firmware v1.2.4 to a test pool of 10 devices before global deployment).</w:t>
+        <w:t>Firmware &amp; Over-The-Air (OTA) Control Center: Standardized deployment panel to package, sign, and push firmware releases to physical devices incrementally (e.g., rolling out Firmware v1.2.4 to a test pool of 10 devices before global deployment).</w:t>
       </w:r>
     </w:p>
     <w:p>
-      <w:pPr>
-        <w:pStyle w:val="ListBullet"/>
-      </w:pPr>
       <w:r>
-        <w:t xml:space="preserve">  Fleet Telemetry Engine: Global heat-map displaying telemetry metrics—signal-to-noise ratio, hardware failure alarms, packet loss percentages, and API response latencies.</w:t>
+        <w:t>Fleet Telemetry Engine: Global heat-map displaying telemetry metrics—signal-to-noise ratio, hardware failure alarms, packet loss percentages, and API response latencies.</w:t>
       </w:r>
     </w:p>
     <w:p>
-      <w:pPr>
-        <w:pStyle w:val="ListBullet"/>
-      </w:pPr>
       <w:r>
-        <w:t xml:space="preserve">  Security Incident Command: Instant lockout dashboard. Allows operators to revoke device credentials and pairing keys instantly if a specific device is flagged as compromised.</w:t>
+        <w:t>Security Incident Command: Instant lockout dashboard. Allows operators to revoke device credentials and pairing keys instantly if a specific device is flagged as compromised.</w:t>
       </w:r>
     </w:p>
     <w:sectPr>
@@ -1439,7 +1116,7 @@
       <w:rFonts w:asciiTheme="majorHAnsi" w:eastAsiaTheme="majorEastAsia" w:hAnsiTheme="majorHAnsi" w:cstheme="majorBidi"/>
       <w:b/>
       <w:bCs/>
-      <w:color w:val="1F4E79"/>
+      <w:color w:val="365F91" w:themeColor="accent1" w:themeShade="BF"/>
       <w:sz w:val="28"/>
       <w:szCs w:val="28"/>
     </w:rPr>
@@ -1463,7 +1140,7 @@
       <w:rFonts w:asciiTheme="majorHAnsi" w:eastAsiaTheme="majorEastAsia" w:hAnsiTheme="majorHAnsi" w:cstheme="majorBidi"/>
       <w:b/>
       <w:bCs/>
-      <w:color w:val="2E74B5"/>
+      <w:color w:val="4F81BD" w:themeColor="accent1"/>
       <w:sz w:val="26"/>
       <w:szCs w:val="26"/>
     </w:rPr>

</xml_diff>